<commit_message>
Add photo collages to dedication and About the Author pages
- Created grampy-buddy collage from 3 photos and added to dedication page
- Created young-matthew collage from 3 photos and added to new About the Author page
- Updated both Clearer-Dogs.docx and clearer-dogs.docx
</commit_message>
<xml_diff>
--- a/Clearer-Dogs.docx
+++ b/Clearer-Dogs.docx
@@ -97,6 +97,46 @@
         <w:br/>
         <w:br/>
         <w:t>And for every dog still waiting to be understood.</w:t>
+      </w:r>
+    </w:p>
+    <w:p/>
+    <w:p>
+      <w:pPr>
+        <w:jc w:val="center"/>
+      </w:pPr>
+      <w:r>
+        <w:drawing>
+          <wp:inline xmlns:a="http://schemas.openxmlformats.org/drawingml/2006/main" xmlns:pic="http://schemas.openxmlformats.org/drawingml/2006/picture">
+            <wp:extent cx="5029200" cy="2243240"/>
+            <wp:docPr id="12" name="Picture 12"/>
+            <wp:cNvGraphicFramePr>
+              <a:graphicFrameLocks noChangeAspect="1"/>
+            </wp:cNvGraphicFramePr>
+            <a:graphic>
+              <a:graphicData uri="http://schemas.openxmlformats.org/drawingml/2006/picture">
+                <pic:pic>
+                  <pic:nvPicPr>
+                    <pic:cNvPr id="0" name="grampy-buddy-collage.jpg"/>
+                    <pic:cNvPicPr/>
+                  </pic:nvPicPr>
+                  <pic:blipFill>
+                    <a:blip r:embed="rId19"/>
+                    <a:stretch>
+                      <a:fillRect/>
+                    </a:stretch>
+                  </pic:blipFill>
+                  <pic:spPr>
+                    <a:xfrm>
+                      <a:off x="0" y="0"/>
+                      <a:ext cx="5029200" cy="2243240"/>
+                    </a:xfrm>
+                    <a:prstGeom prst="rect"/>
+                  </pic:spPr>
+                </pic:pic>
+              </a:graphicData>
+            </a:graphic>
+          </wp:inline>
+        </w:drawing>
       </w:r>
     </w:p>
     <w:p>
@@ -29939,6 +29979,75 @@
         <w:t xml:space="preserve"> Campbell K9’s</w:t>
         <w:br/>
         <w:t xml:space="preserve"> Clearer Dogs: Balanced Training, Calm Leadership, and Building the Relationship Every Dog Needs</w:t>
+      </w:r>
+    </w:p>
+    <w:p>
+      <w:r>
+        <w:br w:type="page"/>
+      </w:r>
+    </w:p>
+    <w:p>
+      <w:pPr>
+        <w:jc w:val="center"/>
+      </w:pPr>
+      <w:r>
+        <w:rPr>
+          <w:b/>
+          <w:sz w:val="36"/>
+        </w:rPr>
+        <w:t>About the Author</w:t>
+      </w:r>
+    </w:p>
+    <w:p/>
+    <w:p>
+      <w:pPr>
+        <w:jc w:val="center"/>
+      </w:pPr>
+      <w:r>
+        <w:drawing>
+          <wp:inline xmlns:a="http://schemas.openxmlformats.org/drawingml/2006/main" xmlns:pic="http://schemas.openxmlformats.org/drawingml/2006/picture">
+            <wp:extent cx="5029200" cy="1069168"/>
+            <wp:docPr id="13" name="Picture 13"/>
+            <wp:cNvGraphicFramePr>
+              <a:graphicFrameLocks noChangeAspect="1"/>
+            </wp:cNvGraphicFramePr>
+            <a:graphic>
+              <a:graphicData uri="http://schemas.openxmlformats.org/drawingml/2006/picture">
+                <pic:pic>
+                  <pic:nvPicPr>
+                    <pic:cNvPr id="0" name="young-matthew-collage.jpg"/>
+                    <pic:cNvPicPr/>
+                  </pic:nvPicPr>
+                  <pic:blipFill>
+                    <a:blip r:embed="rId20"/>
+                    <a:stretch>
+                      <a:fillRect/>
+                    </a:stretch>
+                  </pic:blipFill>
+                  <pic:spPr>
+                    <a:xfrm>
+                      <a:off x="0" y="0"/>
+                      <a:ext cx="5029200" cy="1069168"/>
+                    </a:xfrm>
+                    <a:prstGeom prst="rect"/>
+                  </pic:spPr>
+                </pic:pic>
+              </a:graphicData>
+            </a:graphic>
+          </wp:inline>
+        </w:drawing>
+      </w:r>
+    </w:p>
+    <w:p/>
+    <w:p>
+      <w:pPr>
+        <w:jc w:val="center"/>
+      </w:pPr>
+      <w:r>
+        <w:rPr>
+          <w:sz w:val="22"/>
+        </w:rPr>
+        <w:t>Matthew Campbell is the founder of Campbell K9 and the author of Clearer Dogs. He has spent years helping dogs and their owners build better relationships through balanced training, calm leadership, and clear communication.</w:t>
       </w:r>
     </w:p>
     <w:sectPr>

</xml_diff>